<commit_message>
technically laba4 redady patch
Co-authored-by: Copilot <copilot@github.com>
</commit_message>
<xml_diff>
--- a/CURSOVA/OOP 2026 1Kurs/CURSOVA/Коваль_Олександр_Дмитрович_CURSOVA.docx
+++ b/CURSOVA/OOP 2026 1Kurs/CURSOVA/Коваль_Олександр_Дмитрович_CURSOVA.docx
@@ -8876,40 +8876,43 @@
         <w:t>-</w:t>
       </w:r>
       <w:r>
-        <w:t>картинки, прямокутника, що відображає рівень очок здоров’я мікрооб’єкта, та назва мікрооб’єкта.</w:t>
-      </w:r>
-    </w:p>
-    <w:p>
-      <w:pPr>
-        <w:pStyle w:val="2"/>
-        <w:ind w:left="709"/>
-        <w:rPr>
-          <w:b w:val="0"/>
-          <w:bCs w:val="0"/>
+        <w:t>картинки, прямокутника, що відображає рівень очок здоров’я мікрооб’єкта,</w:t>
+      </w:r>
+      <w:r>
+        <w:t xml:space="preserve"> </w:t>
+      </w:r>
+      <w:r>
+        <w:t>назва мікрооб’єкта</w:t>
+      </w:r>
+      <w:r>
+        <w:t xml:space="preserve"> та маркер команди мікрооб’єкта</w:t>
+      </w:r>
+      <w:r>
+        <w:t>.</w:t>
+      </w:r>
+    </w:p>
+    <w:p>
+      <w:pPr>
+        <w:spacing w:line="360" w:lineRule="auto"/>
+        <w:ind w:firstLine="709"/>
+      </w:pPr>
+    </w:p>
+    <w:p>
+      <w:pPr>
+        <w:jc w:val="center"/>
+        <w:rPr>
           <w:lang w:val="en-US"/>
         </w:rPr>
       </w:pPr>
-    </w:p>
-    <w:p>
-      <w:pPr>
-        <w:pStyle w:val="2"/>
-        <w:ind w:left="709"/>
-        <w:jc w:val="center"/>
-        <w:rPr>
-          <w:b w:val="0"/>
-          <w:bCs w:val="0"/>
-          <w:lang w:val="en-US"/>
-        </w:rPr>
-      </w:pPr>
       <w:r>
         <w:rPr>
           <w:noProof/>
         </w:rPr>
         <w:drawing>
-          <wp:inline distT="0" distB="0" distL="0" distR="0" wp14:anchorId="71B66F23" wp14:editId="189CC99B">
-            <wp:extent cx="4396367" cy="3035935"/>
-            <wp:effectExtent l="0" t="0" r="4445" b="0"/>
-            <wp:docPr id="1452481662" name="Рисунок 2"/>
+          <wp:inline distT="0" distB="0" distL="0" distR="0" wp14:anchorId="450F4C02" wp14:editId="4599A1DA">
+            <wp:extent cx="5827677" cy="5236744"/>
+            <wp:effectExtent l="0" t="0" r="1905" b="2540"/>
+            <wp:docPr id="783022655" name="Рисунок 3"/>
             <wp:cNvGraphicFramePr>
               <a:graphicFrameLocks xmlns:a="http://schemas.openxmlformats.org/drawingml/2006/main" noChangeAspect="1"/>
             </wp:cNvGraphicFramePr>
@@ -8917,13 +8920,13 @@
               <a:graphicData uri="http://schemas.openxmlformats.org/drawingml/2006/picture">
                 <pic:pic xmlns:pic="http://schemas.openxmlformats.org/drawingml/2006/picture">
                   <pic:nvPicPr>
-                    <pic:cNvPr id="0" name="Picture 6"/>
+                    <pic:cNvPr id="0" name="Picture 5"/>
                     <pic:cNvPicPr>
                       <a:picLocks noChangeAspect="1" noChangeArrowheads="1"/>
                     </pic:cNvPicPr>
                   </pic:nvPicPr>
                   <pic:blipFill>
-                    <a:blip r:embed="rId11">
+                    <a:blip r:embed="rId11" cstate="print">
                       <a:extLst>
                         <a:ext uri="{28A0092B-C50C-407E-A947-70E740481C1C}">
                           <a14:useLocalDpi xmlns:a14="http://schemas.microsoft.com/office/drawing/2010/main" val="0"/>
@@ -8938,7 +8941,7 @@
                   <pic:spPr bwMode="auto">
                     <a:xfrm>
                       <a:off x="0" y="0"/>
-                      <a:ext cx="4407797" cy="3043828"/>
+                      <a:ext cx="5827677" cy="5236744"/>
                     </a:xfrm>
                     <a:prstGeom prst="rect">
                       <a:avLst/>
@@ -8958,35 +8961,81 @@
     <w:p>
       <w:pPr>
         <w:jc w:val="center"/>
+      </w:pPr>
+      <w:r>
+        <w:t>Рисунок 2.1 – Зображення мікрооб’єкт</w:t>
+      </w:r>
+      <w:r>
+        <w:t>ів</w:t>
+      </w:r>
+      <w:r>
         <w:rPr>
           <w:lang w:val="en-US"/>
         </w:rPr>
-      </w:pPr>
-      <w:r>
-        <w:t>Рисунок 2.1 – Зображення мікрооб’єкта «Воїн»</w:t>
+        <w:t xml:space="preserve">: </w:t>
+      </w:r>
+      <w:r>
+        <w:t>а) Центуріон за команду союзників</w:t>
+      </w:r>
+      <w:r>
+        <w:rPr>
+          <w:lang w:val="en-US"/>
+        </w:rPr>
+        <w:t>;</w:t>
+      </w:r>
+      <w:r>
+        <w:t xml:space="preserve"> б)</w:t>
+      </w:r>
+      <w:r>
+        <w:rPr>
+          <w:lang w:val="en-US"/>
+        </w:rPr>
+        <w:t xml:space="preserve"> </w:t>
+      </w:r>
+      <w:r>
+        <w:t>Преторіанець за команду союзників</w:t>
+      </w:r>
+      <w:r>
+        <w:rPr>
+          <w:lang w:val="en-US"/>
+        </w:rPr>
+        <w:t>;</w:t>
+      </w:r>
+      <w:r>
+        <w:t xml:space="preserve"> в) Центуріон за команду противників</w:t>
+      </w:r>
+      <w:r>
+        <w:rPr>
+          <w:lang w:val="en-US"/>
+        </w:rPr>
+        <w:t>;</w:t>
+      </w:r>
+      <w:r>
+        <w:t xml:space="preserve"> д) Преторіанець за команду противників </w:t>
       </w:r>
     </w:p>
     <w:p>
       <w:pPr>
         <w:jc w:val="center"/>
+      </w:pPr>
+    </w:p>
+    <w:p>
+      <w:pPr>
+        <w:jc w:val="center"/>
         <w:rPr>
           <w:lang w:val="en-US"/>
         </w:rPr>
       </w:pPr>
-    </w:p>
-    <w:p>
-      <w:pPr>
-        <w:jc w:val="center"/>
-      </w:pPr>
       <w:r>
         <w:rPr>
           <w:noProof/>
         </w:rPr>
+        <w:lastRenderedPageBreak/>
         <w:drawing>
-          <wp:inline distT="0" distB="0" distL="0" distR="0" wp14:anchorId="11D3BB30" wp14:editId="78DB9B9F">
-            <wp:extent cx="6299835" cy="3421380"/>
-            <wp:effectExtent l="0" t="0" r="5715" b="7620"/>
-            <wp:docPr id="421272700" name="Рисунок 1"/>
+          <wp:inline distT="0" distB="0" distL="0" distR="0" wp14:anchorId="3DB25D1E" wp14:editId="6B70DEB7">
+            <wp:extent cx="6299835" cy="3296285"/>
+            <wp:effectExtent l="0" t="0" r="5715" b="0"/>
+            <wp:docPr id="2018383694" name="Рисунок 4"/>
             <wp:cNvGraphicFramePr>
               <a:graphicFrameLocks xmlns:a="http://schemas.openxmlformats.org/drawingml/2006/main" noChangeAspect="1"/>
             </wp:cNvGraphicFramePr>
@@ -8994,7 +9043,7 @@
               <a:graphicData uri="http://schemas.openxmlformats.org/drawingml/2006/picture">
                 <pic:pic xmlns:pic="http://schemas.openxmlformats.org/drawingml/2006/picture">
                   <pic:nvPicPr>
-                    <pic:cNvPr id="0" name="Picture 1"/>
+                    <pic:cNvPr id="0" name="Picture 7"/>
                     <pic:cNvPicPr>
                       <a:picLocks noChangeAspect="1" noChangeArrowheads="1"/>
                     </pic:cNvPicPr>
@@ -9015,7 +9064,7 @@
                   <pic:spPr bwMode="auto">
                     <a:xfrm>
                       <a:off x="0" y="0"/>
-                      <a:ext cx="6299835" cy="3421380"/>
+                      <a:ext cx="6299835" cy="3296285"/>
                     </a:xfrm>
                     <a:prstGeom prst="rect">
                       <a:avLst/>
@@ -9031,6 +9080,11 @@
           </wp:inline>
         </w:drawing>
       </w:r>
+    </w:p>
+    <w:p>
+      <w:pPr>
+        <w:jc w:val="center"/>
+      </w:pPr>
       <w:r>
         <w:t xml:space="preserve"> </w:t>
       </w:r>
@@ -9044,34 +9098,37 @@
         <w:t>2</w:t>
       </w:r>
       <w:r>
-        <w:t xml:space="preserve"> – Зображення мікрооб’єктів</w:t>
+        <w:t xml:space="preserve"> – </w:t>
+      </w:r>
+      <w:r>
+        <w:t>Зображення мікрооб’єктів</w:t>
       </w:r>
       <w:r>
         <w:rPr>
           <w:lang w:val="en-US"/>
         </w:rPr>
-        <w:t>:</w:t>
-      </w:r>
-      <w:r>
+        <w:t xml:space="preserve">: </w:t>
+      </w:r>
+      <w:r>
+        <w:t>а) Воїн за команду союзників</w:t>
+      </w:r>
+      <w:r>
+        <w:rPr>
+          <w:lang w:val="en-US"/>
+        </w:rPr>
+        <w:t>;</w:t>
+      </w:r>
+      <w:r>
+        <w:t xml:space="preserve"> б)</w:t>
+      </w:r>
+      <w:r>
+        <w:rPr>
+          <w:lang w:val="en-US"/>
+        </w:rPr>
         <w:t xml:space="preserve"> </w:t>
       </w:r>
       <w:r>
-        <w:rPr>
-          <w:lang w:val="en-US"/>
-        </w:rPr>
-        <w:t xml:space="preserve">a) </w:t>
-      </w:r>
-      <w:r>
-        <w:t>«Центуріон»</w:t>
-      </w:r>
-      <w:r>
-        <w:rPr>
-          <w:lang w:val="en-US"/>
-        </w:rPr>
-        <w:t xml:space="preserve">; </w:t>
-      </w:r>
-      <w:r>
-        <w:t xml:space="preserve">б) «Преторіанець» </w:t>
+        <w:t>Воїн за команду противників</w:t>
       </w:r>
     </w:p>
     <w:p>
@@ -9131,55 +9188,384 @@
         <w:spacing w:line="360" w:lineRule="auto"/>
         <w:ind w:firstLine="709"/>
       </w:pPr>
-    </w:p>
-    <w:p>
-      <w:pPr>
-        <w:spacing w:line="360" w:lineRule="auto"/>
-        <w:ind w:firstLine="709"/>
+      <w:r>
+        <w:t xml:space="preserve">Кожен макрооб’єкт складається з власної </w:t>
+      </w:r>
+      <w:r>
+        <w:rPr>
+          <w:lang w:val="en-US"/>
+        </w:rPr>
+        <w:t>PNG-</w:t>
+      </w:r>
+      <w:r>
+        <w:t>картинки, прямокутника, що відображає рівень міцності споруди, назва макрооб’єкта, лічильник мікрооб’єктів у реальному часі, що знаходяться в даному макрооб’єкті та маркер, що показую команду до якої належить макрооб’єкт. Всі примітивні графічні елементи зображенні стосовно початкових координат (див. рисунок 2.3 та рисунок 2.4</w:t>
+      </w:r>
+      <w:r>
+        <w:t xml:space="preserve"> та рисунок 2.5</w:t>
+      </w:r>
+      <w:r>
+        <w:t>).</w:t>
+      </w:r>
+    </w:p>
+    <w:p>
+      <w:pPr>
+        <w:spacing w:line="360" w:lineRule="auto"/>
+      </w:pPr>
+    </w:p>
+    <w:p>
+      <w:pPr>
+        <w:spacing w:line="360" w:lineRule="auto"/>
         <w:jc w:val="center"/>
       </w:pPr>
       <w:r>
-        <w:t>(опис макрооб’єктів та самі макрооб’єкти додам пізніше, як будуть реалізовані в програмі)</w:t>
-      </w:r>
-    </w:p>
-    <w:p>
-      <w:pPr>
-        <w:spacing w:line="360" w:lineRule="auto"/>
-        <w:ind w:firstLine="709"/>
+        <w:rPr>
+          <w:noProof/>
+        </w:rPr>
+        <w:lastRenderedPageBreak/>
+        <w:drawing>
+          <wp:inline distT="0" distB="0" distL="0" distR="0" wp14:anchorId="37245F30" wp14:editId="2627EFD0">
+            <wp:extent cx="6232550" cy="3139205"/>
+            <wp:effectExtent l="0" t="0" r="0" b="4445"/>
+            <wp:docPr id="2131238197" name="Рисунок 6"/>
+            <wp:cNvGraphicFramePr>
+              <a:graphicFrameLocks xmlns:a="http://schemas.openxmlformats.org/drawingml/2006/main" noChangeAspect="1"/>
+            </wp:cNvGraphicFramePr>
+            <a:graphic xmlns:a="http://schemas.openxmlformats.org/drawingml/2006/main">
+              <a:graphicData uri="http://schemas.openxmlformats.org/drawingml/2006/picture">
+                <pic:pic xmlns:pic="http://schemas.openxmlformats.org/drawingml/2006/picture">
+                  <pic:nvPicPr>
+                    <pic:cNvPr id="0" name="Picture 11"/>
+                    <pic:cNvPicPr>
+                      <a:picLocks noChangeAspect="1" noChangeArrowheads="1"/>
+                    </pic:cNvPicPr>
+                  </pic:nvPicPr>
+                  <pic:blipFill>
+                    <a:blip r:embed="rId13" cstate="print">
+                      <a:extLst>
+                        <a:ext uri="{28A0092B-C50C-407E-A947-70E740481C1C}">
+                          <a14:useLocalDpi xmlns:a14="http://schemas.microsoft.com/office/drawing/2010/main" val="0"/>
+                        </a:ext>
+                      </a:extLst>
+                    </a:blip>
+                    <a:srcRect/>
+                    <a:stretch>
+                      <a:fillRect/>
+                    </a:stretch>
+                  </pic:blipFill>
+                  <pic:spPr bwMode="auto">
+                    <a:xfrm>
+                      <a:off x="0" y="0"/>
+                      <a:ext cx="6279896" cy="3163052"/>
+                    </a:xfrm>
+                    <a:prstGeom prst="rect">
+                      <a:avLst/>
+                    </a:prstGeom>
+                    <a:noFill/>
+                    <a:ln>
+                      <a:noFill/>
+                    </a:ln>
+                  </pic:spPr>
+                </pic:pic>
+              </a:graphicData>
+            </a:graphic>
+          </wp:inline>
+        </w:drawing>
+      </w:r>
+    </w:p>
+    <w:p>
+      <w:pPr>
+        <w:spacing w:line="360" w:lineRule="auto"/>
         <w:jc w:val="center"/>
+      </w:pPr>
+      <w:r>
+        <w:t>Рисунок 2.</w:t>
+      </w:r>
+      <w:r>
+        <w:t>3</w:t>
+      </w:r>
+      <w:r>
+        <w:t xml:space="preserve"> – Зображення м</w:t>
+      </w:r>
+      <w:r>
+        <w:t>акрооб’єктів</w:t>
+      </w:r>
+      <w:r>
         <w:rPr>
           <w:lang w:val="en-US"/>
         </w:rPr>
-      </w:pPr>
-    </w:p>
-    <w:p>
-      <w:pPr>
-        <w:spacing w:line="360" w:lineRule="auto"/>
-        <w:ind w:firstLine="709"/>
+        <w:t xml:space="preserve">: </w:t>
+      </w:r>
+      <w:r>
+        <w:t>а)</w:t>
+      </w:r>
+      <w:r>
+        <w:t>Башта за команду союзників</w:t>
+      </w:r>
+      <w:r>
+        <w:rPr>
+          <w:lang w:val="en-US"/>
+        </w:rPr>
+        <w:t>;</w:t>
+      </w:r>
+      <w:r>
+        <w:t xml:space="preserve"> б)</w:t>
+      </w:r>
+      <w:r>
+        <w:rPr>
+          <w:lang w:val="en-US"/>
+        </w:rPr>
+        <w:t xml:space="preserve"> </w:t>
+      </w:r>
+      <w:r>
+        <w:t>Башта</w:t>
+      </w:r>
+      <w:r>
+        <w:t xml:space="preserve"> за команду противників</w:t>
+      </w:r>
+    </w:p>
+    <w:p>
+      <w:pPr>
+        <w:spacing w:line="360" w:lineRule="auto"/>
         <w:jc w:val="center"/>
+      </w:pPr>
+    </w:p>
+    <w:p>
+      <w:pPr>
+        <w:spacing w:line="360" w:lineRule="auto"/>
+        <w:jc w:val="center"/>
+      </w:pPr>
+      <w:r>
+        <w:rPr>
+          <w:noProof/>
+        </w:rPr>
+        <w:drawing>
+          <wp:inline distT="0" distB="0" distL="0" distR="0" wp14:anchorId="37693D6B" wp14:editId="21CEC608">
+            <wp:extent cx="6299835" cy="3014345"/>
+            <wp:effectExtent l="0" t="0" r="5715" b="0"/>
+            <wp:docPr id="1906467938" name="Рисунок 7"/>
+            <wp:cNvGraphicFramePr>
+              <a:graphicFrameLocks xmlns:a="http://schemas.openxmlformats.org/drawingml/2006/main" noChangeAspect="1"/>
+            </wp:cNvGraphicFramePr>
+            <a:graphic xmlns:a="http://schemas.openxmlformats.org/drawingml/2006/main">
+              <a:graphicData uri="http://schemas.openxmlformats.org/drawingml/2006/picture">
+                <pic:pic xmlns:pic="http://schemas.openxmlformats.org/drawingml/2006/picture">
+                  <pic:nvPicPr>
+                    <pic:cNvPr id="0" name="Picture 13"/>
+                    <pic:cNvPicPr>
+                      <a:picLocks noChangeAspect="1" noChangeArrowheads="1"/>
+                    </pic:cNvPicPr>
+                  </pic:nvPicPr>
+                  <pic:blipFill>
+                    <a:blip r:embed="rId14" cstate="print">
+                      <a:extLst>
+                        <a:ext uri="{28A0092B-C50C-407E-A947-70E740481C1C}">
+                          <a14:useLocalDpi xmlns:a14="http://schemas.microsoft.com/office/drawing/2010/main" val="0"/>
+                        </a:ext>
+                      </a:extLst>
+                    </a:blip>
+                    <a:srcRect/>
+                    <a:stretch>
+                      <a:fillRect/>
+                    </a:stretch>
+                  </pic:blipFill>
+                  <pic:spPr bwMode="auto">
+                    <a:xfrm>
+                      <a:off x="0" y="0"/>
+                      <a:ext cx="6299835" cy="3014345"/>
+                    </a:xfrm>
+                    <a:prstGeom prst="rect">
+                      <a:avLst/>
+                    </a:prstGeom>
+                    <a:noFill/>
+                    <a:ln>
+                      <a:noFill/>
+                    </a:ln>
+                  </pic:spPr>
+                </pic:pic>
+              </a:graphicData>
+            </a:graphic>
+          </wp:inline>
+        </w:drawing>
+      </w:r>
+    </w:p>
+    <w:p>
+      <w:pPr>
+        <w:spacing w:line="360" w:lineRule="auto"/>
+        <w:jc w:val="center"/>
+      </w:pPr>
+      <w:r>
+        <w:t>Рисунок 2.</w:t>
+      </w:r>
+      <w:r>
+        <w:t>4</w:t>
+      </w:r>
+      <w:r>
+        <w:t xml:space="preserve"> – Зображення макрооб’єктів</w:t>
+      </w:r>
+      <w:r>
         <w:rPr>
           <w:lang w:val="en-US"/>
         </w:rPr>
-      </w:pPr>
-    </w:p>
-    <w:p>
-      <w:pPr>
-        <w:spacing w:line="360" w:lineRule="auto"/>
-        <w:ind w:firstLine="709"/>
+        <w:t xml:space="preserve">: </w:t>
+      </w:r>
+      <w:r>
+        <w:t>а)</w:t>
+      </w:r>
+      <w:r>
+        <w:t>Джерело</w:t>
+      </w:r>
+      <w:r>
+        <w:t xml:space="preserve"> </w:t>
+      </w:r>
+      <w:r>
+        <w:t xml:space="preserve">руди </w:t>
+      </w:r>
+      <w:r>
+        <w:t>за команду союзників</w:t>
+      </w:r>
+      <w:r>
+        <w:rPr>
+          <w:lang w:val="en-US"/>
+        </w:rPr>
+        <w:t>;</w:t>
+      </w:r>
+      <w:r>
+        <w:t xml:space="preserve"> б)</w:t>
+      </w:r>
+      <w:r>
+        <w:rPr>
+          <w:lang w:val="en-US"/>
+        </w:rPr>
+        <w:t xml:space="preserve"> </w:t>
+      </w:r>
+      <w:r>
+        <w:t>Джерело руди</w:t>
+      </w:r>
+      <w:r>
+        <w:t xml:space="preserve"> за команду противників</w:t>
+      </w:r>
+    </w:p>
+    <w:p>
+      <w:pPr>
+        <w:spacing w:line="360" w:lineRule="auto"/>
         <w:jc w:val="center"/>
+      </w:pPr>
+    </w:p>
+    <w:p>
+      <w:pPr>
+        <w:spacing w:line="360" w:lineRule="auto"/>
+        <w:jc w:val="center"/>
+      </w:pPr>
+      <w:r>
+        <w:rPr>
+          <w:noProof/>
+        </w:rPr>
+        <w:lastRenderedPageBreak/>
+        <w:drawing>
+          <wp:inline distT="0" distB="0" distL="0" distR="0" wp14:anchorId="1B0B0D81" wp14:editId="5EE567DF">
+            <wp:extent cx="6299835" cy="3274060"/>
+            <wp:effectExtent l="0" t="0" r="5715" b="2540"/>
+            <wp:docPr id="1557346622" name="Рисунок 8"/>
+            <wp:cNvGraphicFramePr>
+              <a:graphicFrameLocks xmlns:a="http://schemas.openxmlformats.org/drawingml/2006/main" noChangeAspect="1"/>
+            </wp:cNvGraphicFramePr>
+            <a:graphic xmlns:a="http://schemas.openxmlformats.org/drawingml/2006/main">
+              <a:graphicData uri="http://schemas.openxmlformats.org/drawingml/2006/picture">
+                <pic:pic xmlns:pic="http://schemas.openxmlformats.org/drawingml/2006/picture">
+                  <pic:nvPicPr>
+                    <pic:cNvPr id="0" name="Picture 15"/>
+                    <pic:cNvPicPr>
+                      <a:picLocks noChangeAspect="1" noChangeArrowheads="1"/>
+                    </pic:cNvPicPr>
+                  </pic:nvPicPr>
+                  <pic:blipFill>
+                    <a:blip r:embed="rId15" cstate="print">
+                      <a:extLst>
+                        <a:ext uri="{28A0092B-C50C-407E-A947-70E740481C1C}">
+                          <a14:useLocalDpi xmlns:a14="http://schemas.microsoft.com/office/drawing/2010/main" val="0"/>
+                        </a:ext>
+                      </a:extLst>
+                    </a:blip>
+                    <a:srcRect/>
+                    <a:stretch>
+                      <a:fillRect/>
+                    </a:stretch>
+                  </pic:blipFill>
+                  <pic:spPr bwMode="auto">
+                    <a:xfrm>
+                      <a:off x="0" y="0"/>
+                      <a:ext cx="6299835" cy="3274060"/>
+                    </a:xfrm>
+                    <a:prstGeom prst="rect">
+                      <a:avLst/>
+                    </a:prstGeom>
+                    <a:noFill/>
+                    <a:ln>
+                      <a:noFill/>
+                    </a:ln>
+                  </pic:spPr>
+                </pic:pic>
+              </a:graphicData>
+            </a:graphic>
+          </wp:inline>
+        </w:drawing>
+      </w:r>
+    </w:p>
+    <w:p>
+      <w:pPr>
+        <w:spacing w:line="360" w:lineRule="auto"/>
+        <w:jc w:val="center"/>
+      </w:pPr>
+      <w:r>
+        <w:t>Рисунок 2.</w:t>
+      </w:r>
+      <w:r>
+        <w:t>5</w:t>
+      </w:r>
+      <w:r>
+        <w:t xml:space="preserve"> – Зображення макрооб’єктів</w:t>
+      </w:r>
+      <w:r>
         <w:rPr>
           <w:lang w:val="en-US"/>
         </w:rPr>
-      </w:pPr>
-    </w:p>
-    <w:p>
-      <w:pPr>
-        <w:spacing w:line="360" w:lineRule="auto"/>
-        <w:ind w:firstLine="709"/>
+        <w:t xml:space="preserve">: </w:t>
+      </w:r>
+      <w:r>
+        <w:t>а)</w:t>
+      </w:r>
+      <w:r>
+        <w:t xml:space="preserve"> База</w:t>
+      </w:r>
+      <w:r>
+        <w:t xml:space="preserve"> за команду союзників</w:t>
+      </w:r>
+      <w:r>
+        <w:rPr>
+          <w:lang w:val="en-US"/>
+        </w:rPr>
+        <w:t>;</w:t>
+      </w:r>
+      <w:r>
+        <w:t xml:space="preserve"> б)</w:t>
+      </w:r>
+      <w:r>
+        <w:rPr>
+          <w:lang w:val="en-US"/>
+        </w:rPr>
+        <w:t xml:space="preserve"> </w:t>
+      </w:r>
+      <w:r>
+        <w:t xml:space="preserve">База </w:t>
+      </w:r>
+      <w:r>
+        <w:t>за команду противників</w:t>
+      </w:r>
+    </w:p>
+    <w:p>
+      <w:pPr>
+        <w:spacing w:line="360" w:lineRule="auto"/>
         <w:jc w:val="center"/>
-        <w:rPr>
-          <w:lang w:val="en-US"/>
-        </w:rPr>
       </w:pPr>
     </w:p>
     <w:p>
@@ -9598,6 +9984,7 @@
       </w:pPr>
       <w:proofErr w:type="spellStart"/>
       <w:r>
+        <w:lastRenderedPageBreak/>
         <w:t>Rectangle</w:t>
       </w:r>
       <w:proofErr w:type="spellEnd"/>
@@ -9676,7 +10063,6 @@
       </w:pPr>
       <w:proofErr w:type="spellStart"/>
       <w:r>
-        <w:lastRenderedPageBreak/>
         <w:t>setCoordinates</w:t>
       </w:r>
       <w:proofErr w:type="spellEnd"/>
@@ -10492,7 +10878,7 @@
   <w:style w:type="paragraph" w:default="1" w:styleId="a">
     <w:name w:val="Normal"/>
     <w:qFormat/>
-    <w:rsid w:val="00A822F2"/>
+    <w:rsid w:val="00086E60"/>
   </w:style>
   <w:style w:type="paragraph" w:styleId="1">
     <w:name w:val="heading 1"/>

</xml_diff>